<commit_message>
docs(learning): polish doc 16 typography (accent headings, zebra tables, roomier spacing)
- h2 with left accent bar + gradient; inline code highlighted; figures rounded w/ shadow
- docx builder v2: line spacing, dark-blue header + zebra rows + cell margins, code left-accent
- only doc 16 reskinned; this styling is the template for future docs

Co-Authored-By: Claude Opus 4.8 (1M context) <noreply@anthropic.com>
</commit_message>
<xml_diff>
--- a/docs/learning/16-核心数据结构图解-iiodev与pollfunc.docx
+++ b/docs/learning/16-核心数据结构图解-iiodev与pollfunc.docx
@@ -4,7 +4,7 @@
   <w:body>
     <w:p>
       <w:pPr>
-        <w:spacing w:after="200"/>
+        <w:spacing w:before="0" w:after="120" w:line="360" w:lineRule="auto"/>
         <w:jc w:val="center"/>
       </w:pPr>
       <w:r>
@@ -12,35 +12,35 @@
           <w:rFonts w:ascii="Microsoft YaHei" w:eastAsia="Microsoft YaHei" w:hAnsi="Microsoft YaHei"/>
           <w:b/>
           <w:color w:val="0B3D91"/>
-          <w:sz w:val="48"/>
+          <w:sz w:val="50"/>
         </w:rPr>
         <w:t xml:space="preserve">核心数据结构图解struct iio_dev 与 pollfunc</w:t>
       </w:r>
     </w:p>
     <w:p>
       <w:pPr>
-        <w:spacing w:after="200"/>
+        <w:spacing w:before="0" w:after="160" w:line="300" w:lineRule="auto"/>
         <w:jc w:val="center"/>
       </w:pPr>
       <w:r>
         <w:rPr>
           <w:rFonts w:ascii="Microsoft YaHei" w:eastAsia="Microsoft YaHei" w:hAnsi="Microsoft YaHei"/>
           <w:color w:val="555555"/>
-          <w:sz w:val="24"/>
+          <w:sz w:val="23"/>
         </w:rPr>
         <w:t xml:space="preserve">IIO 设备的"总枢纽"与触发缓冲的"工单" —— 内部结构 · 字段 · 创建</w:t>
       </w:r>
     </w:p>
     <w:p>
       <w:pPr>
-        <w:spacing w:after="200"/>
+        <w:spacing w:before="0" w:after="160" w:line="300" w:lineRule="auto"/>
         <w:jc w:val="center"/>
       </w:pPr>
       <w:r>
         <w:rPr>
           <w:rFonts w:ascii="Microsoft YaHei" w:eastAsia="Microsoft YaHei" w:hAnsi="Microsoft YaHei"/>
           <w:color w:val="555555"/>
-          <w:sz w:val="24"/>
+          <w:sz w:val="23"/>
         </w:rPr>
         <w:t xml:space="preserve">MPU-6050 IIO 驱动学习 · 数据结构篇 · 2026 年 10 月</w:t>
       </w:r>
@@ -52,7 +52,10 @@
     </w:p>
     <w:p>
       <w:pPr>
-        <w:spacing w:after="140"/>
+        <w:spacing w:before="300" w:after="150" w:line="312" w:lineRule="auto"/>
+        <w:pBdr>
+          <w:bottom w:val="single" w:sz="18" w:space="3" w:color="C3D2EA"/>
+        </w:pBdr>
       </w:pPr>
       <w:r>
         <w:rPr>
@@ -66,12 +69,13 @@
     </w:p>
     <w:p>
       <w:pPr>
-        <w:spacing w:after="120"/>
+        <w:spacing w:before="0" w:after="130" w:line="324" w:lineRule="auto"/>
         <w:jc w:val="both"/>
       </w:pPr>
       <w:r>
         <w:rPr>
           <w:rFonts w:ascii="Microsoft YaHei" w:eastAsia="Microsoft YaHei" w:hAnsi="Microsoft YaHei"/>
+          <w:color w:val="232A33"/>
           <w:sz w:val="21"/>
         </w:rPr>
         <w:t xml:space="preserve">触发缓冲驱动里有两个结构体最该吃透:struct iio_dev(整个 IIO 设备的总枢纽,probe 里填它、注册它)和 struct iio_poll_func(pollfunc)(触发器与缓冲之间的"工单")。本文用图+表把它们的内部结构、每个字段、在哪创建讲清。</w:t>
@@ -79,7 +83,10 @@
     </w:p>
     <w:p>
       <w:pPr>
-        <w:spacing w:after="140"/>
+        <w:spacing w:before="300" w:after="150" w:line="312" w:lineRule="auto"/>
+        <w:pBdr>
+          <w:bottom w:val="single" w:sz="18" w:space="3" w:color="C3D2EA"/>
+        </w:pBdr>
       </w:pPr>
       <w:r>
         <w:rPr>
@@ -93,12 +100,13 @@
     </w:p>
     <w:p>
       <w:pPr>
-        <w:spacing w:after="120"/>
+        <w:spacing w:before="0" w:after="130" w:line="324" w:lineRule="auto"/>
         <w:jc w:val="both"/>
       </w:pPr>
       <w:r>
         <w:rPr>
           <w:rFonts w:ascii="Microsoft YaHei" w:eastAsia="Microsoft YaHei" w:hAnsi="Microsoft YaHei"/>
+          <w:color w:val="232A33"/>
           <w:sz w:val="21"/>
         </w:rPr>
         <w:t xml:space="preserve">indio_dev 是指向 struct iio_dev 的指针。这个结构体把"设备是谁、能干啥、怎么读、运行时挂了哪些机制"全登记在一起。按作用分四组看:</w:t>
@@ -106,7 +114,7 @@
     </w:p>
     <w:p>
       <w:pPr>
-        <w:spacing w:after="40"/>
+        <w:spacing w:before="0" w:after="40" w:line="312" w:lineRule="auto"/>
         <w:jc w:val="center"/>
       </w:pPr>
       <w:r>
@@ -145,14 +153,15 @@
     </w:p>
     <w:p>
       <w:pPr>
-        <w:spacing w:after="160"/>
+        <w:spacing w:before="0" w:after="170" w:line="312" w:lineRule="auto"/>
         <w:jc w:val="center"/>
       </w:pPr>
       <w:r>
         <w:rPr>
           <w:rFonts w:ascii="Microsoft YaHei" w:eastAsia="Microsoft YaHei" w:hAnsi="Microsoft YaHei"/>
-          <w:color w:val="444444"/>
-          <w:sz w:val="19"/>
+          <w:i/>
+          <w:color w:val="667085"/>
+          <w:sz w:val="18"/>
         </w:rPr>
         <w:t xml:space="preserve">图 1 struct iio_dev 内部结构(四组字段 + 指向的外部对象 + 尾随的私有数据)</w:t>
       </w:r>
@@ -161,13 +170,19 @@
       <w:tblPr>
         <w:tblW w:w="5000" w:type="pct"/>
         <w:tblBorders>
-          <w:top w:val="single" w:sz="4" w:space="0" w:color="9BB0D0"/>
-          <w:left w:val="single" w:sz="4" w:space="0" w:color="9BB0D0"/>
-          <w:bottom w:val="single" w:sz="4" w:space="0" w:color="9BB0D0"/>
-          <w:right w:val="single" w:sz="4" w:space="0" w:color="9BB0D0"/>
-          <w:insideH w:val="single" w:sz="4" w:space="0" w:color="9BB0D0"/>
-          <w:insideV w:val="single" w:sz="4" w:space="0" w:color="9BB0D0"/>
+          <w:top w:val="single" w:sz="4" w:space="0" w:color="DCE4F0"/>
+          <w:left w:val="single" w:sz="4" w:space="0" w:color="DCE4F0"/>
+          <w:bottom w:val="single" w:sz="4" w:space="0" w:color="DCE4F0"/>
+          <w:right w:val="single" w:sz="4" w:space="0" w:color="DCE4F0"/>
+          <w:insideH w:val="single" w:sz="4" w:space="0" w:color="DCE4F0"/>
+          <w:insideV w:val="single" w:sz="4" w:space="0" w:color="DCE4F0"/>
         </w:tblBorders>
+        <w:tblCellMar>
+          <w:top w:w="60" w:type="dxa"/>
+          <w:left w:w="120" w:type="dxa"/>
+          <w:bottom w:w="60" w:type="dxa"/>
+          <w:right w:w="120" w:type="dxa"/>
+        </w:tblCellMar>
         <w:tblLayout w:type="autofit"/>
       </w:tblPr>
       <w:tblGrid>
@@ -178,17 +193,18 @@
       <w:tr>
         <w:tc>
           <w:tcPr>
-            <w:shd w:val="clear" w:fill="E8EEF8"/>
-          </w:tcPr>
-          <w:p>
-            <w:pPr>
-              <w:spacing w:after="40"/>
+            <w:shd w:val="clear" w:fill="0B3D91"/>
+            <w:vAlign w:val="center"/>
+          </w:tcPr>
+          <w:p>
+            <w:pPr>
+              <w:spacing w:before="0" w:after="20" w:line="276" w:lineRule="auto"/>
             </w:pPr>
             <w:r>
               <w:rPr>
                 <w:rFonts w:ascii="Microsoft YaHei" w:eastAsia="Microsoft YaHei" w:hAnsi="Microsoft YaHei"/>
                 <w:b/>
-                <w:color w:val="0B3D91"/>
+                <w:color w:val="FFFFFF"/>
                 <w:sz w:val="19"/>
               </w:rPr>
               <w:t xml:space="preserve">组</w:t>
@@ -197,17 +213,18 @@
         </w:tc>
         <w:tc>
           <w:tcPr>
-            <w:shd w:val="clear" w:fill="E8EEF8"/>
-          </w:tcPr>
-          <w:p>
-            <w:pPr>
-              <w:spacing w:after="40"/>
+            <w:shd w:val="clear" w:fill="0B3D91"/>
+            <w:vAlign w:val="center"/>
+          </w:tcPr>
+          <w:p>
+            <w:pPr>
+              <w:spacing w:before="0" w:after="20" w:line="276" w:lineRule="auto"/>
             </w:pPr>
             <w:r>
               <w:rPr>
                 <w:rFonts w:ascii="Microsoft YaHei" w:eastAsia="Microsoft YaHei" w:hAnsi="Microsoft YaHei"/>
                 <w:b/>
-                <w:color w:val="0B3D91"/>
+                <w:color w:val="FFFFFF"/>
                 <w:sz w:val="19"/>
               </w:rPr>
               <w:t xml:space="preserve">字段</w:t>
@@ -216,17 +233,18 @@
         </w:tc>
         <w:tc>
           <w:tcPr>
-            <w:shd w:val="clear" w:fill="E8EEF8"/>
-          </w:tcPr>
-          <w:p>
-            <w:pPr>
-              <w:spacing w:after="40"/>
+            <w:shd w:val="clear" w:fill="0B3D91"/>
+            <w:vAlign w:val="center"/>
+          </w:tcPr>
+          <w:p>
+            <w:pPr>
+              <w:spacing w:before="0" w:after="20" w:line="276" w:lineRule="auto"/>
             </w:pPr>
             <w:r>
               <w:rPr>
                 <w:rFonts w:ascii="Microsoft YaHei" w:eastAsia="Microsoft YaHei" w:hAnsi="Microsoft YaHei"/>
                 <w:b/>
-                <w:color w:val="0B3D91"/>
+                <w:color w:val="FFFFFF"/>
                 <w:sz w:val="19"/>
               </w:rPr>
               <w:t xml:space="preserve">作用</w:t>
@@ -236,14 +254,18 @@
       </w:tr>
       <w:tr>
         <w:tc>
-          <w:tcPr/>
-          <w:p>
-            <w:pPr>
-              <w:spacing w:after="40"/>
-            </w:pPr>
-            <w:r>
-              <w:rPr>
-                <w:rFonts w:ascii="Microsoft YaHei" w:eastAsia="Microsoft YaHei" w:hAnsi="Microsoft YaHei"/>
+          <w:tcPr>
+            <w:shd w:val="clear" w:fill="F4F8FD"/>
+            <w:vAlign w:val="center"/>
+          </w:tcPr>
+          <w:p>
+            <w:pPr>
+              <w:spacing w:before="0" w:after="20" w:line="276" w:lineRule="auto"/>
+            </w:pPr>
+            <w:r>
+              <w:rPr>
+                <w:rFonts w:ascii="Microsoft YaHei" w:eastAsia="Microsoft YaHei" w:hAnsi="Microsoft YaHei"/>
+                <w:color w:val="2A3340"/>
                 <w:sz w:val="19"/>
               </w:rPr>
               <w:t xml:space="preserve">A 身份</w:t>
@@ -251,14 +273,18 @@
           </w:p>
         </w:tc>
         <w:tc>
-          <w:tcPr/>
-          <w:p>
-            <w:pPr>
-              <w:spacing w:after="40"/>
-            </w:pPr>
-            <w:r>
-              <w:rPr>
-                <w:rFonts w:ascii="Microsoft YaHei" w:eastAsia="Microsoft YaHei" w:hAnsi="Microsoft YaHei"/>
+          <w:tcPr>
+            <w:shd w:val="clear" w:fill="F4F8FD"/>
+            <w:vAlign w:val="center"/>
+          </w:tcPr>
+          <w:p>
+            <w:pPr>
+              <w:spacing w:before="0" w:after="20" w:line="276" w:lineRule="auto"/>
+            </w:pPr>
+            <w:r>
+              <w:rPr>
+                <w:rFonts w:ascii="Microsoft YaHei" w:eastAsia="Microsoft YaHei" w:hAnsi="Microsoft YaHei"/>
+                <w:color w:val="2A3340"/>
                 <w:sz w:val="19"/>
               </w:rPr>
               <w:t xml:space="preserve">id</w:t>
@@ -266,14 +292,18 @@
           </w:p>
         </w:tc>
         <w:tc>
-          <w:tcPr/>
-          <w:p>
-            <w:pPr>
-              <w:spacing w:after="40"/>
-            </w:pPr>
-            <w:r>
-              <w:rPr>
-                <w:rFonts w:ascii="Microsoft YaHei" w:eastAsia="Microsoft YaHei" w:hAnsi="Microsoft YaHei"/>
+          <w:tcPr>
+            <w:shd w:val="clear" w:fill="F4F8FD"/>
+            <w:vAlign w:val="center"/>
+          </w:tcPr>
+          <w:p>
+            <w:pPr>
+              <w:spacing w:before="0" w:after="20" w:line="276" w:lineRule="auto"/>
+            </w:pPr>
+            <w:r>
+              <w:rPr>
+                <w:rFonts w:ascii="Microsoft YaHei" w:eastAsia="Microsoft YaHei" w:hAnsi="Microsoft YaHei"/>
+                <w:color w:val="2A3340"/>
                 <w:sz w:val="19"/>
               </w:rPr>
               <w:t xml:space="preserve">第几个 IIO 设备 → iio:device0 的 0;触发器名 "%s-dev%d" 的 %d</w:t>
@@ -283,14 +313,17 @@
       </w:tr>
       <w:tr>
         <w:tc>
-          <w:tcPr/>
-          <w:p>
-            <w:pPr>
-              <w:spacing w:after="40"/>
-            </w:pPr>
-            <w:r>
-              <w:rPr>
-                <w:rFonts w:ascii="Microsoft YaHei" w:eastAsia="Microsoft YaHei" w:hAnsi="Microsoft YaHei"/>
+          <w:tcPr>
+            <w:vAlign w:val="center"/>
+          </w:tcPr>
+          <w:p>
+            <w:pPr>
+              <w:spacing w:before="0" w:after="20" w:line="276" w:lineRule="auto"/>
+            </w:pPr>
+            <w:r>
+              <w:rPr>
+                <w:rFonts w:ascii="Microsoft YaHei" w:eastAsia="Microsoft YaHei" w:hAnsi="Microsoft YaHei"/>
+                <w:color w:val="2A3340"/>
                 <w:sz w:val="19"/>
               </w:rPr>
               <w:t xml:space="preserve">name</w:t>
@@ -298,14 +331,17 @@
           </w:p>
         </w:tc>
         <w:tc>
-          <w:tcPr/>
-          <w:p>
-            <w:pPr>
-              <w:spacing w:after="40"/>
-            </w:pPr>
-            <w:r>
-              <w:rPr>
-                <w:rFonts w:ascii="Microsoft YaHei" w:eastAsia="Microsoft YaHei" w:hAnsi="Microsoft YaHei"/>
+          <w:tcPr>
+            <w:vAlign w:val="center"/>
+          </w:tcPr>
+          <w:p>
+            <w:pPr>
+              <w:spacing w:before="0" w:after="20" w:line="276" w:lineRule="auto"/>
+            </w:pPr>
+            <w:r>
+              <w:rPr>
+                <w:rFonts w:ascii="Microsoft YaHei" w:eastAsia="Microsoft YaHei" w:hAnsi="Microsoft YaHei"/>
+                <w:color w:val="2A3340"/>
                 <w:sz w:val="19"/>
               </w:rPr>
               <w:t xml:space="preserve">设备名 "mpu6050" → /sys/.../name</w:t>
@@ -315,14 +351,18 @@
       </w:tr>
       <w:tr>
         <w:tc>
-          <w:tcPr/>
-          <w:p>
-            <w:pPr>
-              <w:spacing w:after="40"/>
-            </w:pPr>
-            <w:r>
-              <w:rPr>
-                <w:rFonts w:ascii="Microsoft YaHei" w:eastAsia="Microsoft YaHei" w:hAnsi="Microsoft YaHei"/>
+          <w:tcPr>
+            <w:shd w:val="clear" w:fill="F4F8FD"/>
+            <w:vAlign w:val="center"/>
+          </w:tcPr>
+          <w:p>
+            <w:pPr>
+              <w:spacing w:before="0" w:after="20" w:line="276" w:lineRule="auto"/>
+            </w:pPr>
+            <w:r>
+              <w:rPr>
+                <w:rFonts w:ascii="Microsoft YaHei" w:eastAsia="Microsoft YaHei" w:hAnsi="Microsoft YaHei"/>
+                <w:color w:val="2A3340"/>
                 <w:sz w:val="19"/>
               </w:rPr>
               <w:t xml:space="preserve">dev</w:t>
@@ -330,14 +370,18 @@
           </w:p>
         </w:tc>
         <w:tc>
-          <w:tcPr/>
-          <w:p>
-            <w:pPr>
-              <w:spacing w:after="40"/>
-            </w:pPr>
-            <w:r>
-              <w:rPr>
-                <w:rFonts w:ascii="Microsoft YaHei" w:eastAsia="Microsoft YaHei" w:hAnsi="Microsoft YaHei"/>
+          <w:tcPr>
+            <w:shd w:val="clear" w:fill="F4F8FD"/>
+            <w:vAlign w:val="center"/>
+          </w:tcPr>
+          <w:p>
+            <w:pPr>
+              <w:spacing w:before="0" w:after="20" w:line="276" w:lineRule="auto"/>
+            </w:pPr>
+            <w:r>
+              <w:rPr>
+                <w:rFonts w:ascii="Microsoft YaHei" w:eastAsia="Microsoft YaHei" w:hAnsi="Microsoft YaHei"/>
+                <w:color w:val="2A3340"/>
                 <w:sz w:val="19"/>
               </w:rPr>
               <w:t xml:space="preserve">内嵌的 struct device(Linux 设备模型对象,sysfs 目录由它生成)</w:t>
@@ -347,14 +391,17 @@
       </w:tr>
       <w:tr>
         <w:tc>
-          <w:tcPr/>
-          <w:p>
-            <w:pPr>
-              <w:spacing w:after="40"/>
-            </w:pPr>
-            <w:r>
-              <w:rPr>
-                <w:rFonts w:ascii="Microsoft YaHei" w:eastAsia="Microsoft YaHei" w:hAnsi="Microsoft YaHei"/>
+          <w:tcPr>
+            <w:vAlign w:val="center"/>
+          </w:tcPr>
+          <w:p>
+            <w:pPr>
+              <w:spacing w:before="0" w:after="20" w:line="276" w:lineRule="auto"/>
+            </w:pPr>
+            <w:r>
+              <w:rPr>
+                <w:rFonts w:ascii="Microsoft YaHei" w:eastAsia="Microsoft YaHei" w:hAnsi="Microsoft YaHei"/>
+                <w:color w:val="2A3340"/>
                 <w:sz w:val="19"/>
               </w:rPr>
               <w:t xml:space="preserve">B 能力</w:t>
@@ -362,14 +409,17 @@
           </w:p>
         </w:tc>
         <w:tc>
-          <w:tcPr/>
-          <w:p>
-            <w:pPr>
-              <w:spacing w:after="40"/>
-            </w:pPr>
-            <w:r>
-              <w:rPr>
-                <w:rFonts w:ascii="Microsoft YaHei" w:eastAsia="Microsoft YaHei" w:hAnsi="Microsoft YaHei"/>
+          <w:tcPr>
+            <w:vAlign w:val="center"/>
+          </w:tcPr>
+          <w:p>
+            <w:pPr>
+              <w:spacing w:before="0" w:after="20" w:line="276" w:lineRule="auto"/>
+            </w:pPr>
+            <w:r>
+              <w:rPr>
+                <w:rFonts w:ascii="Microsoft YaHei" w:eastAsia="Microsoft YaHei" w:hAnsi="Microsoft YaHei"/>
+                <w:color w:val="2A3340"/>
                 <w:sz w:val="19"/>
               </w:rPr>
               <w:t xml:space="preserve">modes</w:t>
@@ -377,14 +427,17 @@
           </w:p>
         </w:tc>
         <w:tc>
-          <w:tcPr/>
-          <w:p>
-            <w:pPr>
-              <w:spacing w:after="40"/>
-            </w:pPr>
-            <w:r>
-              <w:rPr>
-                <w:rFonts w:ascii="Microsoft YaHei" w:eastAsia="Microsoft YaHei" w:hAnsi="Microsoft YaHei"/>
+          <w:tcPr>
+            <w:vAlign w:val="center"/>
+          </w:tcPr>
+          <w:p>
+            <w:pPr>
+              <w:spacing w:before="0" w:after="20" w:line="276" w:lineRule="auto"/>
+            </w:pPr>
+            <w:r>
+              <w:rPr>
+                <w:rFonts w:ascii="Microsoft YaHei" w:eastAsia="Microsoft YaHei" w:hAnsi="Microsoft YaHei"/>
+                <w:color w:val="2A3340"/>
                 <w:sz w:val="19"/>
               </w:rPr>
               <w:t xml:space="preserve">支持的模式:INDIO_DIRECT_MODE;触发缓冲补 INDIO_BUFFER_TRIGGERED</w:t>
@@ -394,14 +447,18 @@
       </w:tr>
       <w:tr>
         <w:tc>
-          <w:tcPr/>
-          <w:p>
-            <w:pPr>
-              <w:spacing w:after="40"/>
-            </w:pPr>
-            <w:r>
-              <w:rPr>
-                <w:rFonts w:ascii="Microsoft YaHei" w:eastAsia="Microsoft YaHei" w:hAnsi="Microsoft YaHei"/>
+          <w:tcPr>
+            <w:shd w:val="clear" w:fill="F4F8FD"/>
+            <w:vAlign w:val="center"/>
+          </w:tcPr>
+          <w:p>
+            <w:pPr>
+              <w:spacing w:before="0" w:after="20" w:line="276" w:lineRule="auto"/>
+            </w:pPr>
+            <w:r>
+              <w:rPr>
+                <w:rFonts w:ascii="Microsoft YaHei" w:eastAsia="Microsoft YaHei" w:hAnsi="Microsoft YaHei"/>
+                <w:color w:val="2A3340"/>
                 <w:sz w:val="19"/>
               </w:rPr>
               <w:t xml:space="preserve">currentmode</w:t>
@@ -409,14 +466,18 @@
           </w:p>
         </w:tc>
         <w:tc>
-          <w:tcPr/>
-          <w:p>
-            <w:pPr>
-              <w:spacing w:after="40"/>
-            </w:pPr>
-            <w:r>
-              <w:rPr>
-                <w:rFonts w:ascii="Microsoft YaHei" w:eastAsia="Microsoft YaHei" w:hAnsi="Microsoft YaHei"/>
+          <w:tcPr>
+            <w:shd w:val="clear" w:fill="F4F8FD"/>
+            <w:vAlign w:val="center"/>
+          </w:tcPr>
+          <w:p>
+            <w:pPr>
+              <w:spacing w:before="0" w:after="20" w:line="276" w:lineRule="auto"/>
+            </w:pPr>
+            <w:r>
+              <w:rPr>
+                <w:rFonts w:ascii="Microsoft YaHei" w:eastAsia="Microsoft YaHei" w:hAnsi="Microsoft YaHei"/>
+                <w:color w:val="2A3340"/>
                 <w:sz w:val="19"/>
               </w:rPr>
               <w:t xml:space="preserve">当前所处模式(核心维护)</w:t>
@@ -426,14 +487,17 @@
       </w:tr>
       <w:tr>
         <w:tc>
-          <w:tcPr/>
-          <w:p>
-            <w:pPr>
-              <w:spacing w:after="40"/>
-            </w:pPr>
-            <w:r>
-              <w:rPr>
-                <w:rFonts w:ascii="Microsoft YaHei" w:eastAsia="Microsoft YaHei" w:hAnsi="Microsoft YaHei"/>
+          <w:tcPr>
+            <w:vAlign w:val="center"/>
+          </w:tcPr>
+          <w:p>
+            <w:pPr>
+              <w:spacing w:before="0" w:after="20" w:line="276" w:lineRule="auto"/>
+            </w:pPr>
+            <w:r>
+              <w:rPr>
+                <w:rFonts w:ascii="Microsoft YaHei" w:eastAsia="Microsoft YaHei" w:hAnsi="Microsoft YaHei"/>
+                <w:color w:val="2A3340"/>
                 <w:sz w:val="19"/>
               </w:rPr>
               <w:t xml:space="preserve">C 核心(你填)</w:t>
@@ -441,14 +505,17 @@
           </w:p>
         </w:tc>
         <w:tc>
-          <w:tcPr/>
-          <w:p>
-            <w:pPr>
-              <w:spacing w:after="40"/>
-            </w:pPr>
-            <w:r>
-              <w:rPr>
-                <w:rFonts w:ascii="Microsoft YaHei" w:eastAsia="Microsoft YaHei" w:hAnsi="Microsoft YaHei"/>
+          <w:tcPr>
+            <w:vAlign w:val="center"/>
+          </w:tcPr>
+          <w:p>
+            <w:pPr>
+              <w:spacing w:before="0" w:after="20" w:line="276" w:lineRule="auto"/>
+            </w:pPr>
+            <w:r>
+              <w:rPr>
+                <w:rFonts w:ascii="Microsoft YaHei" w:eastAsia="Microsoft YaHei" w:hAnsi="Microsoft YaHei"/>
+                <w:color w:val="2A3340"/>
                 <w:sz w:val="19"/>
               </w:rPr>
               <w:t xml:space="preserve">info</w:t>
@@ -456,14 +523,17 @@
           </w:p>
         </w:tc>
         <w:tc>
-          <w:tcPr/>
-          <w:p>
-            <w:pPr>
-              <w:spacing w:after="40"/>
-            </w:pPr>
-            <w:r>
-              <w:rPr>
-                <w:rFonts w:ascii="Microsoft YaHei" w:eastAsia="Microsoft YaHei" w:hAnsi="Microsoft YaHei"/>
+          <w:tcPr>
+            <w:vAlign w:val="center"/>
+          </w:tcPr>
+          <w:p>
+            <w:pPr>
+              <w:spacing w:before="0" w:after="20" w:line="276" w:lineRule="auto"/>
+            </w:pPr>
+            <w:r>
+              <w:rPr>
+                <w:rFonts w:ascii="Microsoft YaHei" w:eastAsia="Microsoft YaHei" w:hAnsi="Microsoft YaHei"/>
+                <w:color w:val="2A3340"/>
                 <w:sz w:val="19"/>
               </w:rPr>
               <w:t xml:space="preserve">指向 iio_info 回调表(含 read_raw)</w:t>
@@ -473,14 +543,18 @@
       </w:tr>
       <w:tr>
         <w:tc>
-          <w:tcPr/>
-          <w:p>
-            <w:pPr>
-              <w:spacing w:after="40"/>
-            </w:pPr>
-            <w:r>
-              <w:rPr>
-                <w:rFonts w:ascii="Microsoft YaHei" w:eastAsia="Microsoft YaHei" w:hAnsi="Microsoft YaHei"/>
+          <w:tcPr>
+            <w:shd w:val="clear" w:fill="F4F8FD"/>
+            <w:vAlign w:val="center"/>
+          </w:tcPr>
+          <w:p>
+            <w:pPr>
+              <w:spacing w:before="0" w:after="20" w:line="276" w:lineRule="auto"/>
+            </w:pPr>
+            <w:r>
+              <w:rPr>
+                <w:rFonts w:ascii="Microsoft YaHei" w:eastAsia="Microsoft YaHei" w:hAnsi="Microsoft YaHei"/>
+                <w:color w:val="2A3340"/>
                 <w:sz w:val="19"/>
               </w:rPr>
               <w:t xml:space="preserve">channels/num_channels</w:t>
@@ -488,14 +562,18 @@
           </w:p>
         </w:tc>
         <w:tc>
-          <w:tcPr/>
-          <w:p>
-            <w:pPr>
-              <w:spacing w:after="40"/>
-            </w:pPr>
-            <w:r>
-              <w:rPr>
-                <w:rFonts w:ascii="Microsoft YaHei" w:eastAsia="Microsoft YaHei" w:hAnsi="Microsoft YaHei"/>
+          <w:tcPr>
+            <w:shd w:val="clear" w:fill="F4F8FD"/>
+            <w:vAlign w:val="center"/>
+          </w:tcPr>
+          <w:p>
+            <w:pPr>
+              <w:spacing w:before="0" w:after="20" w:line="276" w:lineRule="auto"/>
+            </w:pPr>
+            <w:r>
+              <w:rPr>
+                <w:rFonts w:ascii="Microsoft YaHei" w:eastAsia="Microsoft YaHei" w:hAnsi="Microsoft YaHei"/>
+                <w:color w:val="2A3340"/>
                 <w:sz w:val="19"/>
               </w:rPr>
               <w:t xml:space="preserve">指向通道表+数量 → 核心据此生成 sysfs、解析缓冲帧</w:t>
@@ -505,14 +583,17 @@
       </w:tr>
       <w:tr>
         <w:tc>
-          <w:tcPr/>
-          <w:p>
-            <w:pPr>
-              <w:spacing w:after="40"/>
-            </w:pPr>
-            <w:r>
-              <w:rPr>
-                <w:rFonts w:ascii="Microsoft YaHei" w:eastAsia="Microsoft YaHei" w:hAnsi="Microsoft YaHei"/>
+          <w:tcPr>
+            <w:vAlign w:val="center"/>
+          </w:tcPr>
+          <w:p>
+            <w:pPr>
+              <w:spacing w:before="0" w:after="20" w:line="276" w:lineRule="auto"/>
+            </w:pPr>
+            <w:r>
+              <w:rPr>
+                <w:rFonts w:ascii="Microsoft YaHei" w:eastAsia="Microsoft YaHei" w:hAnsi="Microsoft YaHei"/>
+                <w:color w:val="2A3340"/>
                 <w:sz w:val="19"/>
               </w:rPr>
               <w:t xml:space="preserve">D 运行时</w:t>
@@ -520,14 +601,17 @@
           </w:p>
         </w:tc>
         <w:tc>
-          <w:tcPr/>
-          <w:p>
-            <w:pPr>
-              <w:spacing w:after="40"/>
-            </w:pPr>
-            <w:r>
-              <w:rPr>
-                <w:rFonts w:ascii="Microsoft YaHei" w:eastAsia="Microsoft YaHei" w:hAnsi="Microsoft YaHei"/>
+          <w:tcPr>
+            <w:vAlign w:val="center"/>
+          </w:tcPr>
+          <w:p>
+            <w:pPr>
+              <w:spacing w:before="0" w:after="20" w:line="276" w:lineRule="auto"/>
+            </w:pPr>
+            <w:r>
+              <w:rPr>
+                <w:rFonts w:ascii="Microsoft YaHei" w:eastAsia="Microsoft YaHei" w:hAnsi="Microsoft YaHei"/>
+                <w:color w:val="2A3340"/>
                 <w:sz w:val="19"/>
               </w:rPr>
               <w:t xml:space="preserve">buffer/pollfunc/trig</w:t>
@@ -535,14 +619,17 @@
           </w:p>
         </w:tc>
         <w:tc>
-          <w:tcPr/>
-          <w:p>
-            <w:pPr>
-              <w:spacing w:after="40"/>
-            </w:pPr>
-            <w:r>
-              <w:rPr>
-                <w:rFonts w:ascii="Microsoft YaHei" w:eastAsia="Microsoft YaHei" w:hAnsi="Microsoft YaHei"/>
+          <w:tcPr>
+            <w:vAlign w:val="center"/>
+          </w:tcPr>
+          <w:p>
+            <w:pPr>
+              <w:spacing w:before="0" w:after="20" w:line="276" w:lineRule="auto"/>
+            </w:pPr>
+            <w:r>
+              <w:rPr>
+                <w:rFonts w:ascii="Microsoft YaHei" w:eastAsia="Microsoft YaHei" w:hAnsi="Microsoft YaHei"/>
+                <w:color w:val="2A3340"/>
                 <w:sz w:val="19"/>
               </w:rPr>
               <w:t xml:space="preserve">指向 kfifo 缓冲 / 工单 / 当前触发器(核心填)</w:t>
@@ -552,14 +639,18 @@
       </w:tr>
       <w:tr>
         <w:tc>
-          <w:tcPr/>
-          <w:p>
-            <w:pPr>
-              <w:spacing w:after="40"/>
-            </w:pPr>
-            <w:r>
-              <w:rPr>
-                <w:rFonts w:ascii="Microsoft YaHei" w:eastAsia="Microsoft YaHei" w:hAnsi="Microsoft YaHei"/>
+          <w:tcPr>
+            <w:shd w:val="clear" w:fill="F4F8FD"/>
+            <w:vAlign w:val="center"/>
+          </w:tcPr>
+          <w:p>
+            <w:pPr>
+              <w:spacing w:before="0" w:after="20" w:line="276" w:lineRule="auto"/>
+            </w:pPr>
+            <w:r>
+              <w:rPr>
+                <w:rFonts w:ascii="Microsoft YaHei" w:eastAsia="Microsoft YaHei" w:hAnsi="Microsoft YaHei"/>
+                <w:color w:val="2A3340"/>
                 <w:sz w:val="19"/>
               </w:rPr>
               <w:t xml:space="preserve">scan_bytes/active_scan_mask</w:t>
@@ -567,14 +658,18 @@
           </w:p>
         </w:tc>
         <w:tc>
-          <w:tcPr/>
-          <w:p>
-            <w:pPr>
-              <w:spacing w:after="40"/>
-            </w:pPr>
-            <w:r>
-              <w:rPr>
-                <w:rFonts w:ascii="Microsoft YaHei" w:eastAsia="Microsoft YaHei" w:hAnsi="Microsoft YaHei"/>
+          <w:tcPr>
+            <w:shd w:val="clear" w:fill="F4F8FD"/>
+            <w:vAlign w:val="center"/>
+          </w:tcPr>
+          <w:p>
+            <w:pPr>
+              <w:spacing w:before="0" w:after="20" w:line="276" w:lineRule="auto"/>
+            </w:pPr>
+            <w:r>
+              <w:rPr>
+                <w:rFonts w:ascii="Microsoft YaHei" w:eastAsia="Microsoft YaHei" w:hAnsi="Microsoft YaHei"/>
+                <w:color w:val="2A3340"/>
                 <w:sz w:val="19"/>
               </w:rPr>
               <w:t xml:space="preserve">开缓冲时核心算:选了哪些通道、一帧多少字节</w:t>
@@ -583,15 +678,20 @@
         </w:tc>
       </w:tr>
     </w:tbl>
-    <w:p/>
-    <w:p>
-      <w:pPr>
-        <w:spacing w:after="120"/>
+    <w:p>
+      <w:pPr>
+        <w:spacing w:after="60"/>
+      </w:pPr>
+    </w:p>
+    <w:p>
+      <w:pPr>
+        <w:spacing w:before="0" w:after="130" w:line="324" w:lineRule="auto"/>
         <w:jc w:val="both"/>
       </w:pPr>
       <w:r>
         <w:rPr>
           <w:rFonts w:ascii="Microsoft YaHei" w:eastAsia="Microsoft YaHei" w:hAnsi="Microsoft YaHei"/>
+          <w:color w:val="232A33"/>
           <w:sz w:val="21"/>
         </w:rPr>
         <w:t xml:space="preserve">所以 probe 的本质就是:填好 C 组(info/channels)→ 建起 D 组(缓冲/触发器)→ 注册。核心运行时就靠读这张"登记表"来回调你、生成接口、搬数据。</w:t>
@@ -604,7 +704,10 @@
     </w:p>
     <w:p>
       <w:pPr>
-        <w:spacing w:after="140"/>
+        <w:spacing w:before="300" w:after="150" w:line="312" w:lineRule="auto"/>
+        <w:pBdr>
+          <w:bottom w:val="single" w:sz="18" w:space="3" w:color="C3D2EA"/>
+        </w:pBdr>
       </w:pPr>
       <w:r>
         <w:rPr>
@@ -618,12 +721,13 @@
     </w:p>
     <w:p>
       <w:pPr>
-        <w:spacing w:after="120"/>
+        <w:spacing w:before="0" w:after="130" w:line="324" w:lineRule="auto"/>
         <w:jc w:val="both"/>
       </w:pPr>
       <w:r>
         <w:rPr>
           <w:rFonts w:ascii="Microsoft YaHei" w:eastAsia="Microsoft YaHei" w:hAnsi="Microsoft YaHei"/>
+          <w:color w:val="232A33"/>
           <w:sz w:val="21"/>
         </w:rPr>
         <w:t xml:space="preserve">触发器只会喊"滴答",它不知道该读什么;缓冲是目标,但得有人去填。pollfunc 就是夹在中间的工单,写明"滴答一到,先记时间,再读一帧塞进缓冲"。</w:t>
@@ -631,7 +735,7 @@
     </w:p>
     <w:p>
       <w:pPr>
-        <w:spacing w:after="40"/>
+        <w:spacing w:before="0" w:after="40" w:line="312" w:lineRule="auto"/>
         <w:jc w:val="center"/>
       </w:pPr>
       <w:r>
@@ -670,40 +774,50 @@
     </w:p>
     <w:p>
       <w:pPr>
-        <w:spacing w:after="160"/>
+        <w:spacing w:before="0" w:after="170" w:line="312" w:lineRule="auto"/>
         <w:jc w:val="center"/>
       </w:pPr>
       <w:r>
         <w:rPr>
           <w:rFonts w:ascii="Microsoft YaHei" w:eastAsia="Microsoft YaHei" w:hAnsi="Microsoft YaHei"/>
-          <w:color w:val="444444"/>
-          <w:sz w:val="19"/>
+          <w:i/>
+          <w:color w:val="667085"/>
+          <w:sz w:val="18"/>
         </w:rPr>
         <w:t xml:space="preserve">图 2 pollfunc 的结构(左)与它在"触发器→缓冲"链条中的位置(右)</w:t>
       </w:r>
     </w:p>
     <w:p>
       <w:pPr>
-        <w:spacing w:after="140"/>
+        <w:spacing w:before="200" w:after="100" w:line="312" w:lineRule="auto"/>
+        <w:ind w:left="140"/>
+        <w:pBdr>
+          <w:left w:val="single" w:sz="24" w:space="8" w:color="9BB6E4"/>
+        </w:pBdr>
       </w:pPr>
       <w:r>
         <w:rPr>
           <w:rFonts w:ascii="Microsoft YaHei" w:eastAsia="Microsoft YaHei" w:hAnsi="Microsoft YaHei"/>
           <w:b/>
-          <w:color w:val="123A7A"/>
-          <w:sz w:val="27"/>
+          <w:color w:val="14459A"/>
+          <w:sz w:val="26"/>
         </w:rPr>
         <w:t xml:space="preserve">2.1 结构字段</w:t>
       </w:r>
     </w:p>
     <w:p>
       <w:pPr>
-        <w:spacing w:after="0"/>
-        <w:shd w:val="clear" w:fill="F2F4F8"/>
+        <w:spacing w:before="0" w:after="0" w:line="252" w:lineRule="auto"/>
+        <w:ind w:left="120"/>
+        <w:pBdr>
+          <w:left w:val="single" w:sz="24" w:space="8" w:color="5B8DEF"/>
+        </w:pBdr>
+        <w:shd w:val="clear" w:fill="F4F7FC"/>
       </w:pPr>
       <w:r>
         <w:rPr>
           <w:rFonts w:ascii="Consolas" w:eastAsia="Microsoft YaHei" w:hAnsi="Consolas"/>
+          <w:color w:val="24303F"/>
           <w:sz w:val="18"/>
         </w:rPr>
         <w:t xml:space="preserve">struct iio_poll_func {</w:t>
@@ -711,12 +825,17 @@
     </w:p>
     <w:p>
       <w:pPr>
-        <w:spacing w:after="0"/>
-        <w:shd w:val="clear" w:fill="F2F4F8"/>
+        <w:spacing w:before="0" w:after="0" w:line="252" w:lineRule="auto"/>
+        <w:ind w:left="120"/>
+        <w:pBdr>
+          <w:left w:val="single" w:sz="24" w:space="8" w:color="5B8DEF"/>
+        </w:pBdr>
+        <w:shd w:val="clear" w:fill="F4F7FC"/>
       </w:pPr>
       <w:r>
         <w:rPr>
           <w:rFonts w:ascii="Consolas" w:eastAsia="Microsoft YaHei" w:hAnsi="Consolas"/>
+          <w:color w:val="24303F"/>
           <w:sz w:val="18"/>
         </w:rPr>
         <w:t xml:space="preserve">    struct iio_dev *indio_dev;              // 回指设备 → 底半部靠它拿 regmap</w:t>
@@ -724,12 +843,17 @@
     </w:p>
     <w:p>
       <w:pPr>
-        <w:spacing w:after="0"/>
-        <w:shd w:val="clear" w:fill="F2F4F8"/>
+        <w:spacing w:before="0" w:after="0" w:line="252" w:lineRule="auto"/>
+        <w:ind w:left="120"/>
+        <w:pBdr>
+          <w:left w:val="single" w:sz="24" w:space="8" w:color="5B8DEF"/>
+        </w:pBdr>
+        <w:shd w:val="clear" w:fill="F4F7FC"/>
       </w:pPr>
       <w:r>
         <w:rPr>
           <w:rFonts w:ascii="Consolas" w:eastAsia="Microsoft YaHei" w:hAnsi="Consolas"/>
+          <w:color w:val="24303F"/>
           <w:sz w:val="18"/>
         </w:rPr>
         <w:t xml:space="preserve">    irqreturn_t (*h)(int irq, void *p);     // 顶半部 = iio_pollfunc_store_time</w:t>
@@ -737,12 +861,17 @@
     </w:p>
     <w:p>
       <w:pPr>
-        <w:spacing w:after="0"/>
-        <w:shd w:val="clear" w:fill="F2F4F8"/>
+        <w:spacing w:before="0" w:after="0" w:line="252" w:lineRule="auto"/>
+        <w:ind w:left="120"/>
+        <w:pBdr>
+          <w:left w:val="single" w:sz="24" w:space="8" w:color="5B8DEF"/>
+        </w:pBdr>
+        <w:shd w:val="clear" w:fill="F4F7FC"/>
       </w:pPr>
       <w:r>
         <w:rPr>
           <w:rFonts w:ascii="Consolas" w:eastAsia="Microsoft YaHei" w:hAnsi="Consolas"/>
+          <w:color w:val="24303F"/>
           <w:sz w:val="18"/>
         </w:rPr>
         <w:t xml:space="preserve">    irqreturn_t (*thread)(int irq, void *p);// 底半部 = mpu6050_trigger_handler</w:t>
@@ -750,12 +879,17 @@
     </w:p>
     <w:p>
       <w:pPr>
-        <w:spacing w:after="0"/>
-        <w:shd w:val="clear" w:fill="F2F4F8"/>
+        <w:spacing w:before="0" w:after="0" w:line="252" w:lineRule="auto"/>
+        <w:ind w:left="120"/>
+        <w:pBdr>
+          <w:left w:val="single" w:sz="24" w:space="8" w:color="5B8DEF"/>
+        </w:pBdr>
+        <w:shd w:val="clear" w:fill="F4F7FC"/>
       </w:pPr>
       <w:r>
         <w:rPr>
           <w:rFonts w:ascii="Consolas" w:eastAsia="Microsoft YaHei" w:hAnsi="Consolas"/>
+          <w:color w:val="24303F"/>
           <w:sz w:val="18"/>
         </w:rPr>
         <w:t xml:space="preserve">    int type;                               // 中断 flags(IRQF_ONESHOT)</w:t>
@@ -763,12 +897,17 @@
     </w:p>
     <w:p>
       <w:pPr>
-        <w:spacing w:after="0"/>
-        <w:shd w:val="clear" w:fill="F2F4F8"/>
+        <w:spacing w:before="0" w:after="0" w:line="252" w:lineRule="auto"/>
+        <w:ind w:left="120"/>
+        <w:pBdr>
+          <w:left w:val="single" w:sz="24" w:space="8" w:color="5B8DEF"/>
+        </w:pBdr>
+        <w:shd w:val="clear" w:fill="F4F7FC"/>
       </w:pPr>
       <w:r>
         <w:rPr>
           <w:rFonts w:ascii="Consolas" w:eastAsia="Microsoft YaHei" w:hAnsi="Consolas"/>
+          <w:color w:val="24303F"/>
           <w:sz w:val="18"/>
         </w:rPr>
         <w:t xml:space="preserve">    struct list_head list;                  // 挂进触发器的消费者链表</w:t>
@@ -776,12 +915,17 @@
     </w:p>
     <w:p>
       <w:pPr>
-        <w:spacing w:after="0"/>
-        <w:shd w:val="clear" w:fill="F2F4F8"/>
+        <w:spacing w:before="0" w:after="0" w:line="252" w:lineRule="auto"/>
+        <w:ind w:left="120"/>
+        <w:pBdr>
+          <w:left w:val="single" w:sz="24" w:space="8" w:color="5B8DEF"/>
+        </w:pBdr>
+        <w:shd w:val="clear" w:fill="F4F7FC"/>
       </w:pPr>
       <w:r>
         <w:rPr>
           <w:rFonts w:ascii="Consolas" w:eastAsia="Microsoft YaHei" w:hAnsi="Consolas"/>
+          <w:color w:val="24303F"/>
           <w:sz w:val="18"/>
         </w:rPr>
         <w:t xml:space="preserve">    void *data;                             // 备用(未用)</w:t>
@@ -789,12 +933,17 @@
     </w:p>
     <w:p>
       <w:pPr>
-        <w:spacing w:after="0"/>
-        <w:shd w:val="clear" w:fill="F2F4F8"/>
+        <w:spacing w:before="0" w:after="0" w:line="252" w:lineRule="auto"/>
+        <w:ind w:left="120"/>
+        <w:pBdr>
+          <w:left w:val="single" w:sz="24" w:space="8" w:color="5B8DEF"/>
+        </w:pBdr>
+        <w:shd w:val="clear" w:fill="F4F7FC"/>
       </w:pPr>
       <w:r>
         <w:rPr>
           <w:rFonts w:ascii="Consolas" w:eastAsia="Microsoft YaHei" w:hAnsi="Consolas"/>
+          <w:color w:val="24303F"/>
           <w:sz w:val="18"/>
         </w:rPr>
         <w:t xml:space="preserve">    s64 timestamp;                          // ★顶半部写、底半部读★</w:t>
@@ -802,29 +951,44 @@
     </w:p>
     <w:p>
       <w:pPr>
-        <w:spacing w:after="0"/>
-        <w:shd w:val="clear" w:fill="F2F4F8"/>
+        <w:spacing w:before="0" w:after="0" w:line="252" w:lineRule="auto"/>
+        <w:ind w:left="120"/>
+        <w:pBdr>
+          <w:left w:val="single" w:sz="24" w:space="8" w:color="5B8DEF"/>
+        </w:pBdr>
+        <w:shd w:val="clear" w:fill="F4F7FC"/>
       </w:pPr>
       <w:r>
         <w:rPr>
           <w:rFonts w:ascii="Consolas" w:eastAsia="Microsoft YaHei" w:hAnsi="Consolas"/>
+          <w:color w:val="24303F"/>
           <w:sz w:val="18"/>
         </w:rPr>
         <w:t xml:space="preserve">};</w:t>
       </w:r>
     </w:p>
-    <w:p/>
+    <w:p>
+      <w:pPr>
+        <w:spacing w:after="80"/>
+      </w:pPr>
+    </w:p>
     <w:tbl>
       <w:tblPr>
         <w:tblW w:w="5000" w:type="pct"/>
         <w:tblBorders>
-          <w:top w:val="single" w:sz="4" w:space="0" w:color="9BB0D0"/>
-          <w:left w:val="single" w:sz="4" w:space="0" w:color="9BB0D0"/>
-          <w:bottom w:val="single" w:sz="4" w:space="0" w:color="9BB0D0"/>
-          <w:right w:val="single" w:sz="4" w:space="0" w:color="9BB0D0"/>
-          <w:insideH w:val="single" w:sz="4" w:space="0" w:color="9BB0D0"/>
-          <w:insideV w:val="single" w:sz="4" w:space="0" w:color="9BB0D0"/>
+          <w:top w:val="single" w:sz="4" w:space="0" w:color="DCE4F0"/>
+          <w:left w:val="single" w:sz="4" w:space="0" w:color="DCE4F0"/>
+          <w:bottom w:val="single" w:sz="4" w:space="0" w:color="DCE4F0"/>
+          <w:right w:val="single" w:sz="4" w:space="0" w:color="DCE4F0"/>
+          <w:insideH w:val="single" w:sz="4" w:space="0" w:color="DCE4F0"/>
+          <w:insideV w:val="single" w:sz="4" w:space="0" w:color="DCE4F0"/>
         </w:tblBorders>
+        <w:tblCellMar>
+          <w:top w:w="60" w:type="dxa"/>
+          <w:left w:w="120" w:type="dxa"/>
+          <w:bottom w:w="60" w:type="dxa"/>
+          <w:right w:w="120" w:type="dxa"/>
+        </w:tblCellMar>
         <w:tblLayout w:type="autofit"/>
       </w:tblPr>
       <w:tblGrid>
@@ -835,17 +999,18 @@
       <w:tr>
         <w:tc>
           <w:tcPr>
-            <w:shd w:val="clear" w:fill="E8EEF8"/>
-          </w:tcPr>
-          <w:p>
-            <w:pPr>
-              <w:spacing w:after="40"/>
+            <w:shd w:val="clear" w:fill="0B3D91"/>
+            <w:vAlign w:val="center"/>
+          </w:tcPr>
+          <w:p>
+            <w:pPr>
+              <w:spacing w:before="0" w:after="20" w:line="276" w:lineRule="auto"/>
             </w:pPr>
             <w:r>
               <w:rPr>
                 <w:rFonts w:ascii="Microsoft YaHei" w:eastAsia="Microsoft YaHei" w:hAnsi="Microsoft YaHei"/>
                 <w:b/>
-                <w:color w:val="0B3D91"/>
+                <w:color w:val="FFFFFF"/>
                 <w:sz w:val="19"/>
               </w:rPr>
               <w:t xml:space="preserve">字段</w:t>
@@ -854,17 +1019,18 @@
         </w:tc>
         <w:tc>
           <w:tcPr>
-            <w:shd w:val="clear" w:fill="E8EEF8"/>
-          </w:tcPr>
-          <w:p>
-            <w:pPr>
-              <w:spacing w:after="40"/>
+            <w:shd w:val="clear" w:fill="0B3D91"/>
+            <w:vAlign w:val="center"/>
+          </w:tcPr>
+          <w:p>
+            <w:pPr>
+              <w:spacing w:before="0" w:after="20" w:line="276" w:lineRule="auto"/>
             </w:pPr>
             <w:r>
               <w:rPr>
                 <w:rFonts w:ascii="Microsoft YaHei" w:eastAsia="Microsoft YaHei" w:hAnsi="Microsoft YaHei"/>
                 <w:b/>
-                <w:color w:val="0B3D91"/>
+                <w:color w:val="FFFFFF"/>
                 <w:sz w:val="19"/>
               </w:rPr>
               <w:t xml:space="preserve">在本项目是谁</w:t>
@@ -873,17 +1039,18 @@
         </w:tc>
         <w:tc>
           <w:tcPr>
-            <w:shd w:val="clear" w:fill="E8EEF8"/>
-          </w:tcPr>
-          <w:p>
-            <w:pPr>
-              <w:spacing w:after="40"/>
+            <w:shd w:val="clear" w:fill="0B3D91"/>
+            <w:vAlign w:val="center"/>
+          </w:tcPr>
+          <w:p>
+            <w:pPr>
+              <w:spacing w:before="0" w:after="20" w:line="276" w:lineRule="auto"/>
             </w:pPr>
             <w:r>
               <w:rPr>
                 <w:rFonts w:ascii="Microsoft YaHei" w:eastAsia="Microsoft YaHei" w:hAnsi="Microsoft YaHei"/>
                 <w:b/>
-                <w:color w:val="0B3D91"/>
+                <w:color w:val="FFFFFF"/>
                 <w:sz w:val="19"/>
               </w:rPr>
               <w:t xml:space="preserve">作用</w:t>
@@ -893,14 +1060,18 @@
       </w:tr>
       <w:tr>
         <w:tc>
-          <w:tcPr/>
-          <w:p>
-            <w:pPr>
-              <w:spacing w:after="40"/>
-            </w:pPr>
-            <w:r>
-              <w:rPr>
-                <w:rFonts w:ascii="Microsoft YaHei" w:eastAsia="Microsoft YaHei" w:hAnsi="Microsoft YaHei"/>
+          <w:tcPr>
+            <w:shd w:val="clear" w:fill="F4F8FD"/>
+            <w:vAlign w:val="center"/>
+          </w:tcPr>
+          <w:p>
+            <w:pPr>
+              <w:spacing w:before="0" w:after="20" w:line="276" w:lineRule="auto"/>
+            </w:pPr>
+            <w:r>
+              <w:rPr>
+                <w:rFonts w:ascii="Microsoft YaHei" w:eastAsia="Microsoft YaHei" w:hAnsi="Microsoft YaHei"/>
+                <w:color w:val="2A3340"/>
                 <w:sz w:val="19"/>
               </w:rPr>
               <w:t xml:space="preserve">indio_dev</w:t>
@@ -908,14 +1079,18 @@
           </w:p>
         </w:tc>
         <w:tc>
-          <w:tcPr/>
-          <w:p>
-            <w:pPr>
-              <w:spacing w:after="40"/>
-            </w:pPr>
-            <w:r>
-              <w:rPr>
-                <w:rFonts w:ascii="Microsoft YaHei" w:eastAsia="Microsoft YaHei" w:hAnsi="Microsoft YaHei"/>
+          <w:tcPr>
+            <w:shd w:val="clear" w:fill="F4F8FD"/>
+            <w:vAlign w:val="center"/>
+          </w:tcPr>
+          <w:p>
+            <w:pPr>
+              <w:spacing w:before="0" w:after="20" w:line="276" w:lineRule="auto"/>
+            </w:pPr>
+            <w:r>
+              <w:rPr>
+                <w:rFonts w:ascii="Microsoft YaHei" w:eastAsia="Microsoft YaHei" w:hAnsi="Microsoft YaHei"/>
+                <w:color w:val="2A3340"/>
                 <w:sz w:val="19"/>
               </w:rPr>
               <w:t xml:space="preserve">iio:device0</w:t>
@@ -923,14 +1098,18 @@
           </w:p>
         </w:tc>
         <w:tc>
-          <w:tcPr/>
-          <w:p>
-            <w:pPr>
-              <w:spacing w:after="40"/>
-            </w:pPr>
-            <w:r>
-              <w:rPr>
-                <w:rFonts w:ascii="Microsoft YaHei" w:eastAsia="Microsoft YaHei" w:hAnsi="Microsoft YaHei"/>
+          <w:tcPr>
+            <w:shd w:val="clear" w:fill="F4F8FD"/>
+            <w:vAlign w:val="center"/>
+          </w:tcPr>
+          <w:p>
+            <w:pPr>
+              <w:spacing w:before="0" w:after="20" w:line="276" w:lineRule="auto"/>
+            </w:pPr>
+            <w:r>
+              <w:rPr>
+                <w:rFonts w:ascii="Microsoft YaHei" w:eastAsia="Microsoft YaHei" w:hAnsi="Microsoft YaHei"/>
+                <w:color w:val="2A3340"/>
                 <w:sz w:val="19"/>
               </w:rPr>
               <w:t xml:space="preserve">底半部 iio_priv 拿到 regmap</w:t>
@@ -940,14 +1119,17 @@
       </w:tr>
       <w:tr>
         <w:tc>
-          <w:tcPr/>
-          <w:p>
-            <w:pPr>
-              <w:spacing w:after="40"/>
-            </w:pPr>
-            <w:r>
-              <w:rPr>
-                <w:rFonts w:ascii="Microsoft YaHei" w:eastAsia="Microsoft YaHei" w:hAnsi="Microsoft YaHei"/>
+          <w:tcPr>
+            <w:vAlign w:val="center"/>
+          </w:tcPr>
+          <w:p>
+            <w:pPr>
+              <w:spacing w:before="0" w:after="20" w:line="276" w:lineRule="auto"/>
+            </w:pPr>
+            <w:r>
+              <w:rPr>
+                <w:rFonts w:ascii="Microsoft YaHei" w:eastAsia="Microsoft YaHei" w:hAnsi="Microsoft YaHei"/>
+                <w:color w:val="2A3340"/>
                 <w:sz w:val="19"/>
               </w:rPr>
               <w:t xml:space="preserve">h</w:t>
@@ -955,14 +1137,17 @@
           </w:p>
         </w:tc>
         <w:tc>
-          <w:tcPr/>
-          <w:p>
-            <w:pPr>
-              <w:spacing w:after="40"/>
-            </w:pPr>
-            <w:r>
-              <w:rPr>
-                <w:rFonts w:ascii="Microsoft YaHei" w:eastAsia="Microsoft YaHei" w:hAnsi="Microsoft YaHei"/>
+          <w:tcPr>
+            <w:vAlign w:val="center"/>
+          </w:tcPr>
+          <w:p>
+            <w:pPr>
+              <w:spacing w:before="0" w:after="20" w:line="276" w:lineRule="auto"/>
+            </w:pPr>
+            <w:r>
+              <w:rPr>
+                <w:rFonts w:ascii="Microsoft YaHei" w:eastAsia="Microsoft YaHei" w:hAnsi="Microsoft YaHei"/>
+                <w:color w:val="2A3340"/>
                 <w:sz w:val="19"/>
               </w:rPr>
               <w:t xml:space="preserve">iio_pollfunc_store_time</w:t>
@@ -970,14 +1155,17 @@
           </w:p>
         </w:tc>
         <w:tc>
-          <w:tcPr/>
-          <w:p>
-            <w:pPr>
-              <w:spacing w:after="40"/>
-            </w:pPr>
-            <w:r>
-              <w:rPr>
-                <w:rFonts w:ascii="Microsoft YaHei" w:eastAsia="Microsoft YaHei" w:hAnsi="Microsoft YaHei"/>
+          <w:tcPr>
+            <w:vAlign w:val="center"/>
+          </w:tcPr>
+          <w:p>
+            <w:pPr>
+              <w:spacing w:before="0" w:after="20" w:line="276" w:lineRule="auto"/>
+            </w:pPr>
+            <w:r>
+              <w:rPr>
+                <w:rFonts w:ascii="Microsoft YaHei" w:eastAsia="Microsoft YaHei" w:hAnsi="Microsoft YaHei"/>
+                <w:color w:val="2A3340"/>
                 <w:sz w:val="19"/>
               </w:rPr>
               <w:t xml:space="preserve">滴答瞬间记时间戳到 timestamp(快,中断上下文)</w:t>
@@ -987,14 +1175,18 @@
       </w:tr>
       <w:tr>
         <w:tc>
-          <w:tcPr/>
-          <w:p>
-            <w:pPr>
-              <w:spacing w:after="40"/>
-            </w:pPr>
-            <w:r>
-              <w:rPr>
-                <w:rFonts w:ascii="Microsoft YaHei" w:eastAsia="Microsoft YaHei" w:hAnsi="Microsoft YaHei"/>
+          <w:tcPr>
+            <w:shd w:val="clear" w:fill="F4F8FD"/>
+            <w:vAlign w:val="center"/>
+          </w:tcPr>
+          <w:p>
+            <w:pPr>
+              <w:spacing w:before="0" w:after="20" w:line="276" w:lineRule="auto"/>
+            </w:pPr>
+            <w:r>
+              <w:rPr>
+                <w:rFonts w:ascii="Microsoft YaHei" w:eastAsia="Microsoft YaHei" w:hAnsi="Microsoft YaHei"/>
+                <w:color w:val="2A3340"/>
                 <w:sz w:val="19"/>
               </w:rPr>
               <w:t xml:space="preserve">thread</w:t>
@@ -1002,14 +1194,18 @@
           </w:p>
         </w:tc>
         <w:tc>
-          <w:tcPr/>
-          <w:p>
-            <w:pPr>
-              <w:spacing w:after="40"/>
-            </w:pPr>
-            <w:r>
-              <w:rPr>
-                <w:rFonts w:ascii="Microsoft YaHei" w:eastAsia="Microsoft YaHei" w:hAnsi="Microsoft YaHei"/>
+          <w:tcPr>
+            <w:shd w:val="clear" w:fill="F4F8FD"/>
+            <w:vAlign w:val="center"/>
+          </w:tcPr>
+          <w:p>
+            <w:pPr>
+              <w:spacing w:before="0" w:after="20" w:line="276" w:lineRule="auto"/>
+            </w:pPr>
+            <w:r>
+              <w:rPr>
+                <w:rFonts w:ascii="Microsoft YaHei" w:eastAsia="Microsoft YaHei" w:hAnsi="Microsoft YaHei"/>
+                <w:color w:val="2A3340"/>
                 <w:sz w:val="19"/>
               </w:rPr>
               <w:t xml:space="preserve">mpu6050_trigger_handler</w:t>
@@ -1017,14 +1213,18 @@
           </w:p>
         </w:tc>
         <w:tc>
-          <w:tcPr/>
-          <w:p>
-            <w:pPr>
-              <w:spacing w:after="40"/>
-            </w:pPr>
-            <w:r>
-              <w:rPr>
-                <w:rFonts w:ascii="Microsoft YaHei" w:eastAsia="Microsoft YaHei" w:hAnsi="Microsoft YaHei"/>
+          <w:tcPr>
+            <w:shd w:val="clear" w:fill="F4F8FD"/>
+            <w:vAlign w:val="center"/>
+          </w:tcPr>
+          <w:p>
+            <w:pPr>
+              <w:spacing w:before="0" w:after="20" w:line="276" w:lineRule="auto"/>
+            </w:pPr>
+            <w:r>
+              <w:rPr>
+                <w:rFonts w:ascii="Microsoft YaHei" w:eastAsia="Microsoft YaHei" w:hAnsi="Microsoft YaHei"/>
+                <w:color w:val="2A3340"/>
                 <w:sz w:val="19"/>
               </w:rPr>
               <w:t xml:space="preserve">线程里 regmap_bulk_read + push 进缓冲(可睡眠)</w:t>
@@ -1034,14 +1234,17 @@
       </w:tr>
       <w:tr>
         <w:tc>
-          <w:tcPr/>
-          <w:p>
-            <w:pPr>
-              <w:spacing w:after="40"/>
-            </w:pPr>
-            <w:r>
-              <w:rPr>
-                <w:rFonts w:ascii="Microsoft YaHei" w:eastAsia="Microsoft YaHei" w:hAnsi="Microsoft YaHei"/>
+          <w:tcPr>
+            <w:vAlign w:val="center"/>
+          </w:tcPr>
+          <w:p>
+            <w:pPr>
+              <w:spacing w:before="0" w:after="20" w:line="276" w:lineRule="auto"/>
+            </w:pPr>
+            <w:r>
+              <w:rPr>
+                <w:rFonts w:ascii="Microsoft YaHei" w:eastAsia="Microsoft YaHei" w:hAnsi="Microsoft YaHei"/>
+                <w:color w:val="2A3340"/>
                 <w:sz w:val="19"/>
               </w:rPr>
               <w:t xml:space="preserve">type</w:t>
@@ -1049,14 +1252,17 @@
           </w:p>
         </w:tc>
         <w:tc>
-          <w:tcPr/>
-          <w:p>
-            <w:pPr>
-              <w:spacing w:after="40"/>
-            </w:pPr>
-            <w:r>
-              <w:rPr>
-                <w:rFonts w:ascii="Microsoft YaHei" w:eastAsia="Microsoft YaHei" w:hAnsi="Microsoft YaHei"/>
+          <w:tcPr>
+            <w:vAlign w:val="center"/>
+          </w:tcPr>
+          <w:p>
+            <w:pPr>
+              <w:spacing w:before="0" w:after="20" w:line="276" w:lineRule="auto"/>
+            </w:pPr>
+            <w:r>
+              <w:rPr>
+                <w:rFonts w:ascii="Microsoft YaHei" w:eastAsia="Microsoft YaHei" w:hAnsi="Microsoft YaHei"/>
+                <w:color w:val="2A3340"/>
                 <w:sz w:val="19"/>
               </w:rPr>
               <w:t xml:space="preserve">IRQF_ONESHOT</w:t>
@@ -1064,14 +1270,17 @@
           </w:p>
         </w:tc>
         <w:tc>
-          <w:tcPr/>
-          <w:p>
-            <w:pPr>
-              <w:spacing w:after="40"/>
-            </w:pPr>
-            <w:r>
-              <w:rPr>
-                <w:rFonts w:ascii="Microsoft YaHei" w:eastAsia="Microsoft YaHei" w:hAnsi="Microsoft YaHei"/>
+          <w:tcPr>
+            <w:vAlign w:val="center"/>
+          </w:tcPr>
+          <w:p>
+            <w:pPr>
+              <w:spacing w:before="0" w:after="20" w:line="276" w:lineRule="auto"/>
+            </w:pPr>
+            <w:r>
+              <w:rPr>
+                <w:rFonts w:ascii="Microsoft YaHei" w:eastAsia="Microsoft YaHei" w:hAnsi="Microsoft YaHei"/>
+                <w:color w:val="2A3340"/>
                 <w:sz w:val="19"/>
               </w:rPr>
               <w:t xml:space="preserve">决定这张工单的虚拟中断怎么申请</w:t>
@@ -1081,14 +1290,18 @@
       </w:tr>
       <w:tr>
         <w:tc>
-          <w:tcPr/>
-          <w:p>
-            <w:pPr>
-              <w:spacing w:after="40"/>
-            </w:pPr>
-            <w:r>
-              <w:rPr>
-                <w:rFonts w:ascii="Microsoft YaHei" w:eastAsia="Microsoft YaHei" w:hAnsi="Microsoft YaHei"/>
+          <w:tcPr>
+            <w:shd w:val="clear" w:fill="F4F8FD"/>
+            <w:vAlign w:val="center"/>
+          </w:tcPr>
+          <w:p>
+            <w:pPr>
+              <w:spacing w:before="0" w:after="20" w:line="276" w:lineRule="auto"/>
+            </w:pPr>
+            <w:r>
+              <w:rPr>
+                <w:rFonts w:ascii="Microsoft YaHei" w:eastAsia="Microsoft YaHei" w:hAnsi="Microsoft YaHei"/>
+                <w:color w:val="2A3340"/>
                 <w:sz w:val="19"/>
               </w:rPr>
               <w:t xml:space="preserve">timestamp</w:t>
@@ -1096,14 +1309,18 @@
           </w:p>
         </w:tc>
         <w:tc>
-          <w:tcPr/>
-          <w:p>
-            <w:pPr>
-              <w:spacing w:after="40"/>
-            </w:pPr>
-            <w:r>
-              <w:rPr>
-                <w:rFonts w:ascii="Microsoft YaHei" w:eastAsia="Microsoft YaHei" w:hAnsi="Microsoft YaHei"/>
+          <w:tcPr>
+            <w:shd w:val="clear" w:fill="F4F8FD"/>
+            <w:vAlign w:val="center"/>
+          </w:tcPr>
+          <w:p>
+            <w:pPr>
+              <w:spacing w:before="0" w:after="20" w:line="276" w:lineRule="auto"/>
+            </w:pPr>
+            <w:r>
+              <w:rPr>
+                <w:rFonts w:ascii="Microsoft YaHei" w:eastAsia="Microsoft YaHei" w:hAnsi="Microsoft YaHei"/>
+                <w:color w:val="2A3340"/>
                 <w:sz w:val="19"/>
               </w:rPr>
               <w:t xml:space="preserve">—</w:t>
@@ -1111,14 +1328,18 @@
           </w:p>
         </w:tc>
         <w:tc>
-          <w:tcPr/>
-          <w:p>
-            <w:pPr>
-              <w:spacing w:after="40"/>
-            </w:pPr>
-            <w:r>
-              <w:rPr>
-                <w:rFonts w:ascii="Microsoft YaHei" w:eastAsia="Microsoft YaHei" w:hAnsi="Microsoft YaHei"/>
+          <w:tcPr>
+            <w:shd w:val="clear" w:fill="F4F8FD"/>
+            <w:vAlign w:val="center"/>
+          </w:tcPr>
+          <w:p>
+            <w:pPr>
+              <w:spacing w:before="0" w:after="20" w:line="276" w:lineRule="auto"/>
+            </w:pPr>
+            <w:r>
+              <w:rPr>
+                <w:rFonts w:ascii="Microsoft YaHei" w:eastAsia="Microsoft YaHei" w:hAnsi="Microsoft YaHei"/>
+                <w:color w:val="2A3340"/>
                 <w:sz w:val="19"/>
               </w:rPr>
               <w:t xml:space="preserve">顶半部写、底半部读:iio_push_...(.., pf-&gt;timestamp)</w:t>
@@ -1127,29 +1348,38 @@
         </w:tc>
       </w:tr>
     </w:tbl>
-    <w:p/>
-    <w:p>
-      <w:pPr>
-        <w:spacing w:after="140"/>
+    <w:p>
+      <w:pPr>
+        <w:spacing w:after="60"/>
+      </w:pPr>
+    </w:p>
+    <w:p>
+      <w:pPr>
+        <w:spacing w:before="200" w:after="100" w:line="312" w:lineRule="auto"/>
+        <w:ind w:left="140"/>
+        <w:pBdr>
+          <w:left w:val="single" w:sz="24" w:space="8" w:color="9BB6E4"/>
+        </w:pBdr>
       </w:pPr>
       <w:r>
         <w:rPr>
           <w:rFonts w:ascii="Microsoft YaHei" w:eastAsia="Microsoft YaHei" w:hAnsi="Microsoft YaHei"/>
           <w:b/>
-          <w:color w:val="123A7A"/>
-          <w:sz w:val="27"/>
+          <w:color w:val="14459A"/>
+          <w:sz w:val="26"/>
         </w:rPr>
         <w:t xml:space="preserve">2.2 两半如何接力</w:t>
       </w:r>
     </w:p>
     <w:p>
       <w:pPr>
-        <w:spacing w:after="120"/>
+        <w:spacing w:before="0" w:after="130" w:line="324" w:lineRule="auto"/>
         <w:jc w:val="both"/>
       </w:pPr>
       <w:r>
         <w:rPr>
           <w:rFonts w:ascii="Microsoft YaHei" w:eastAsia="Microsoft YaHei" w:hAnsi="Microsoft YaHei"/>
+          <w:color w:val="232A33"/>
           <w:sz w:val="21"/>
         </w:rPr>
         <w:t xml:space="preserve">绑定到触发器时,核心按"线程化中断"把 h 当硬处理、thread 当线程函数。触发器一响:① h 记时间戳,返回 IRQ_WAKE_THREAD 唤醒线程 → ② thread 在线程里读 I2C、push 进缓冲(用 ① 记下的 pf-&gt;timestamp)。拆两半是因为:① 在中断上下文必须极快、不能睡眠;② I2C 读会睡眠,必须放线程——这正是内核"中断上下半部"的标准分工。</w:t>
@@ -1157,21 +1387,25 @@
     </w:p>
     <w:p>
       <w:pPr>
-        <w:spacing w:after="140"/>
+        <w:spacing w:before="200" w:after="100" w:line="312" w:lineRule="auto"/>
+        <w:ind w:left="140"/>
+        <w:pBdr>
+          <w:left w:val="single" w:sz="24" w:space="8" w:color="9BB6E4"/>
+        </w:pBdr>
       </w:pPr>
       <w:r>
         <w:rPr>
           <w:rFonts w:ascii="Microsoft YaHei" w:eastAsia="Microsoft YaHei" w:hAnsi="Microsoft YaHei"/>
           <w:b/>
-          <w:color w:val="123A7A"/>
-          <w:sz w:val="27"/>
+          <w:color w:val="14459A"/>
+          <w:sz w:val="26"/>
         </w:rPr>
         <w:t xml:space="preserve">2.3 它在哪被创建</w:t>
       </w:r>
     </w:p>
     <w:p>
       <w:pPr>
-        <w:spacing w:after="40"/>
+        <w:spacing w:before="0" w:after="40" w:line="312" w:lineRule="auto"/>
         <w:jc w:val="center"/>
       </w:pPr>
       <w:r>
@@ -1210,26 +1444,28 @@
     </w:p>
     <w:p>
       <w:pPr>
-        <w:spacing w:after="160"/>
+        <w:spacing w:before="0" w:after="170" w:line="312" w:lineRule="auto"/>
         <w:jc w:val="center"/>
       </w:pPr>
       <w:r>
         <w:rPr>
           <w:rFonts w:ascii="Microsoft YaHei" w:eastAsia="Microsoft YaHei" w:hAnsi="Microsoft YaHei"/>
-          <w:color w:val="444444"/>
-          <w:sz w:val="19"/>
+          <w:i/>
+          <w:color w:val="667085"/>
+          <w:sz w:val="18"/>
         </w:rPr>
         <w:t xml:space="preserve">图 3 pollfunc 的创建调用链:你传两个函数进去,核心帮你建</w:t>
       </w:r>
     </w:p>
     <w:p>
       <w:pPr>
-        <w:spacing w:after="120"/>
+        <w:spacing w:before="0" w:after="130" w:line="324" w:lineRule="auto"/>
         <w:jc w:val="both"/>
       </w:pPr>
       <w:r>
         <w:rPr>
           <w:rFonts w:ascii="Microsoft YaHei" w:eastAsia="Microsoft YaHei" w:hAnsi="Microsoft YaHei"/>
+          <w:color w:val="232A33"/>
           <w:sz w:val="21"/>
         </w:rPr>
         <w:t xml:space="preserve">你不直接 new 一个 pollfunc,而是把两个函数交给 devm_iio_triggered_buffer_setup,它内部 iio_alloc_pollfunc(h, thread, IRQF_ONESHOT, ...) 把它们包进一张新工单,指针存进 indio_dev-&gt;pollfunc(独立一块内存);同时还分配 kfifo 缓冲。devm_ 负责移除时自动释放。运行时再由 current_trigger 把这张工单挂到触发器上。</w:t>
@@ -1237,7 +1473,10 @@
     </w:p>
     <w:p>
       <w:pPr>
-        <w:spacing w:after="140"/>
+        <w:spacing w:before="300" w:after="150" w:line="312" w:lineRule="auto"/>
+        <w:pBdr>
+          <w:bottom w:val="single" w:sz="18" w:space="3" w:color="C3D2EA"/>
+        </w:pBdr>
       </w:pPr>
       <w:r>
         <w:rPr>
@@ -1251,13 +1490,19 @@
     </w:p>
     <w:p>
       <w:pPr>
-        <w:spacing w:after="120"/>
+        <w:spacing w:before="0" w:after="140" w:line="312" w:lineRule="auto"/>
         <w:jc w:val="both"/>
-      </w:pPr>
-      <w:r>
-        <w:rPr>
-          <w:rFonts w:ascii="Microsoft YaHei" w:eastAsia="Microsoft YaHei" w:hAnsi="Microsoft YaHei"/>
-          <w:sz w:val="21"/>
+        <w:ind w:left="150"/>
+        <w:pBdr>
+          <w:left w:val="single" w:sz="24" w:space="8" w:color="F0A020"/>
+        </w:pBdr>
+        <w:shd w:val="clear" w:fill="FFF8EC"/>
+      </w:pPr>
+      <w:r>
+        <w:rPr>
+          <w:rFonts w:ascii="Microsoft YaHei" w:eastAsia="Microsoft YaHei" w:hAnsi="Microsoft YaHei"/>
+          <w:color w:val="5A4A20"/>
+          <w:sz w:val="20"/>
         </w:rPr>
         <w:t xml:space="preserve">本文为 MPU-6050 IIO 驱动学习的数据结构篇,承接剖析篇。系列文档见 docs/learning/;配套代码见 examples/learning-driver/。仓库:github.com/fyy0619-cell/xiangmu</w:t>
       </w:r>
@@ -1265,7 +1510,7 @@
     <w:sectPr>
       <w:footerReference w:type="default" r:id="rId3"/>
       <w:pgSz w:w="11906" w:h="16838"/>
-      <w:pgMar w:top="1247" w:right="1134" w:bottom="1418" w:left="1134" w:header="720" w:footer="680" w:gutter="0"/>
+      <w:pgMar w:top="1300" w:right="1134" w:bottom="1418" w:left="1134" w:header="720" w:footer="680" w:gutter="0"/>
     </w:sectPr>
   </w:body>
 </w:document>
@@ -1281,7 +1526,7 @@
       <w:rPr>
         <w:rFonts w:ascii="Microsoft YaHei" w:eastAsia="Microsoft YaHei" w:hAnsi="Microsoft YaHei"/>
         <w:sz w:val="18"/>
-        <w:color w:val="666666"/>
+        <w:color w:val="888888"/>
       </w:rPr>
       <w:t xml:space="preserve">第 </w:t>
     </w:r>
@@ -1290,7 +1535,7 @@
         <w:rPr>
           <w:rFonts w:ascii="Microsoft YaHei" w:eastAsia="Microsoft YaHei" w:hAnsi="Microsoft YaHei"/>
           <w:sz w:val="18"/>
-          <w:color w:val="666666"/>
+          <w:color w:val="888888"/>
         </w:rPr>
         <w:t>1</w:t>
       </w:r>
@@ -1299,7 +1544,7 @@
       <w:rPr>
         <w:rFonts w:ascii="Microsoft YaHei" w:eastAsia="Microsoft YaHei" w:hAnsi="Microsoft YaHei"/>
         <w:sz w:val="18"/>
-        <w:color w:val="666666"/>
+        <w:color w:val="888888"/>
       </w:rPr>
       <w:t xml:space="preserve"> 页 / 共 </w:t>
     </w:r>
@@ -1308,7 +1553,7 @@
         <w:rPr>
           <w:rFonts w:ascii="Microsoft YaHei" w:eastAsia="Microsoft YaHei" w:hAnsi="Microsoft YaHei"/>
           <w:sz w:val="18"/>
-          <w:color w:val="666666"/>
+          <w:color w:val="888888"/>
         </w:rPr>
         <w:t>1</w:t>
       </w:r>
@@ -1317,7 +1562,7 @@
       <w:rPr>
         <w:rFonts w:ascii="Microsoft YaHei" w:eastAsia="Microsoft YaHei" w:hAnsi="Microsoft YaHei"/>
         <w:sz w:val="18"/>
-        <w:color w:val="666666"/>
+        <w:color w:val="888888"/>
       </w:rPr>
       <w:t xml:space="preserve"> 页</w:t>
     </w:r>

</xml_diff>